<commit_message>
docs: update petcare report with revised team member IDs and enhanced product description
</commit_message>
<xml_diff>
--- a/report/Bài báo cáo quản lý phòng khám thú cưng petcare.docx
+++ b/report/Bài báo cáo quản lý phòng khám thú cưng petcare.docx
@@ -2159,6 +2159,14 @@
               </w:rPr>
               <w:t>2305CT</w:t>
             </w:r>
+            <w:r>
+              <w:rPr>
+                <w:spacing w:val="-2"/>
+                <w:sz w:val="27"/>
+                <w:lang w:val="en-US"/>
+              </w:rPr>
+              <w:t>8130</w:t>
+            </w:r>
           </w:p>
         </w:tc>
         <w:tc>
@@ -2254,6 +2262,14 @@
                 <w:lang w:val="en-US"/>
               </w:rPr>
               <w:t>2305CT</w:t>
+            </w:r>
+            <w:r>
+              <w:rPr>
+                <w:spacing w:val="-2"/>
+                <w:sz w:val="27"/>
+                <w:lang w:val="en-US"/>
+              </w:rPr>
+              <w:t>2346</w:t>
             </w:r>
           </w:p>
         </w:tc>
@@ -7506,6 +7522,7 @@
                 <w:sz w:val="26"/>
                 <w:szCs w:val="26"/>
               </w:rPr>
+              <w:lastRenderedPageBreak/>
               <w:t>4</w:t>
             </w:r>
           </w:p>
@@ -7577,7 +7594,6 @@
                 <w:sz w:val="26"/>
                 <w:szCs w:val="26"/>
               </w:rPr>
-              <w:lastRenderedPageBreak/>
               <w:t>5</w:t>
             </w:r>
           </w:p>
@@ -8514,8 +8530,19 @@
           <w:sz w:val="26"/>
           <w:szCs w:val="26"/>
         </w:rPr>
+        <w:t xml:space="preserve">- Quản lý nhân viên: Thêm mới nhân sự (bác sĩ thú y, nhân viên hỗ trợ), cập nhật thông </w:t>
+      </w:r>
+      <w:r>
+        <w:rPr>
+          <w:b w:val="0"/>
+          <w:bCs w:val="0"/>
+          <w:i w:val="0"/>
+          <w:iCs w:val="0"/>
+          <w:sz w:val="26"/>
+          <w:szCs w:val="26"/>
+        </w:rPr>
         <w:lastRenderedPageBreak/>
-        <w:t>- Quản lý nhân viên: Thêm mới nhân sự (bác sĩ thú y, nhân viên hỗ trợ), cập nhật thông tin cá nhân, phân quyền tài khoản hoặc khóa tài khoản nhân viên.</w:t>
+        <w:t>tin cá nhân, phân quyền tài khoản hoặc khóa tài khoản nhân viên.</w:t>
       </w:r>
     </w:p>
     <w:p>
@@ -11516,6 +11543,7 @@
               </w:rPr>
             </w:pPr>
             <w:r>
+              <w:lastRenderedPageBreak/>
               <w:t>id</w:t>
             </w:r>
           </w:p>
@@ -11572,7 +11600,6 @@
               </w:rPr>
             </w:pPr>
             <w:r>
-              <w:lastRenderedPageBreak/>
               <w:t>appointment_id</w:t>
             </w:r>
           </w:p>
@@ -17861,7 +17888,7 @@
         <w:jc w:val="both"/>
       </w:pPr>
       <w:r>
-        <w:t>Sản phẩm có giao diện thân thiện, hiện đại, dễ sử dụng và hoàn toàn phù hợp với nhu cầu thực tiễn của một phòng khám thú y. Hệ thống hoạt động ổn định, tốc độ phản hồi nhanh và hỗ trợ đầy đủ các quy trình nghiệp vụ từ việc đặt lịch của khách hàng đến khâu phê duyệt, chẩn đoán bệnh và thanh toán hóa đơn của nhân viên. Cơ sở dữ liệu MySQL được thiết kế chuẩn hóa cao, thiết lập đầy đủ khóa chính, khóa ngoại kết hợp với các ràng buộc xóa liên đới (ON DELETE CASCADE) giúp hạn chế trùng lặp dữ liệu và đảm bảo tính nhất quán của hệ thống. Việc áp dụng mô hình MVC giúp mã nguồn được tổ chức rõ ràng, phân tách rạch ròi giữa logic xử lý nghiệp vụ (Servlet), kết nối CSDL (JDBC/DAO) và hiển thị (JSP), tạo điều kiện thuận lợi cho việc bảo trì, nâng cấp và mở rộng trong tương lai. Ngoài ra, cơ chế bộ lọc (Filter) kiểm soát đăng nhập giúp nâng cao tính bảo mật của hệ thống.</w:t>
+        <w:t>Sản phẩm có giao diện thân thiện, hiện đại, dễ sử dụng và hoàn toàn phù hợp với nhu cầu thực tiễn của một phòng khám thú y. Hệ thống hoạt động ổn định, tốc độ phản hồi nhanh và hỗ trợ đầy đủ các quy trình nghiệp vụ từ việc đặt lịch của khách hàng đến khâu phê duyệt, chẩn đoán bệnh và thanh toán hóa đơn của nhân viên. Cơ sở dữ liệu MySQL được thiết kế chuẩn hóa cao, thiết lập đầy đủ khóa chính, khóa ngoại kết hợp với các ràng buộc xóa liên đới  giúp hạn chế trùng lặp dữ liệu và đảm bảo tính nhất quán của hệ thống. Việc áp dụng mô hình MVC giúp mã nguồn được tổ chức rõ ràng, phân tách rạch ròi giữa logic xử lý nghiệp vụ (Servlet), kết nối CSDL (JDBC/DAO) và hiển thị (JSP), tạo điều kiện thuận lợi cho việc bảo trì, nâng cấp và mở rộng trong tương lai. Ngoài ra, cơ chế bộ lọc (Filter) kiểm soát đăng nhập giúp nâng cao tính bảo mật của hệ thống.</w:t>
       </w:r>
     </w:p>
     <w:p>
@@ -17939,11 +17966,11 @@
         <w:jc w:val="both"/>
       </w:pPr>
       <w:r>
-        <w:t xml:space="preserve">Bên cạnh những kết quả đạt được, hệ thống vẫn còn một số hạn chế như: </w:t>
+        <w:t xml:space="preserve">Bên cạnh những kết quả đạt được, hệ thống vẫn còn một số hạn chế như: chưa hỗ trợ chức năng gửi email hoặc tin nhắn SMS thông báo tự động đến khách hàng </w:t>
       </w:r>
       <w:r>
         <w:lastRenderedPageBreak/>
-        <w:t>chưa hỗ trợ chức năng gửi email hoặc tin nhắn SMS thông báo tự động đến khách hàng khi lịch hẹn được phê duyệt hoặc hóa đơn thanh toán hoàn thành. Hệ thống hiện mới hoạt động trên môi trường cục bộ (localhost) và chưa được triển khai thực tế trên các máy chủ internet công cộng hoặc nền tảng đám mây (Cloud hosting). Ngoài ra, các tính năng liên lạc trực tiếp (Live Chat) giữa bác sĩ thú y và chủ nuôi thú cưng, hay ứng dụng di động đi kèm vẫn chưa được thực hiện.</w:t>
+        <w:t>khi lịch hẹn được phê duyệt hoặc hóa đơn thanh toán hoàn thành. Hệ thống hiện mới hoạt động trên môi trường cục bộ (localhost) và chưa được triển khai thực tế trên các máy chủ internet công cộng hoặc nền tảng đám mây (Cloud hosting). Ngoài ra, các tính năng liên lạc trực tiếp (Live Chat) giữa bác sĩ thú y và chủ nuôi thú cưng, hay ứng dụng di động đi kèm vẫn chưa được thực hiện.</w:t>
       </w:r>
     </w:p>
     <w:p>
@@ -21927,7 +21954,6 @@
   <w:style w:type="character" w:default="1" w:styleId="Phngmcinhcuaoanvn">
     <w:name w:val="Default Paragraph Font"/>
     <w:uiPriority w:val="1"/>
-    <w:semiHidden/>
     <w:unhideWhenUsed/>
   </w:style>
   <w:style w:type="table" w:default="1" w:styleId="BangThngthng">

</xml_diff>